<commit_message>
redesign ui of recipe book, change final project proposal
</commit_message>
<xml_diff>
--- a/Đề cương đồ án_6051071073_PhamHieuMinh.docx
+++ b/Đề cương đồ án_6051071073_PhamHieuMinh.docx
@@ -174,7 +174,7 @@
                     </wp:anchor>
                   </w:drawing>
                 </mc:Choice>
-                <mc:Fallback xmlns:w16sdtdh="http://schemas.microsoft.com/office/word/2020/wordml/sdtdatahash" xmlns:w16du="http://schemas.microsoft.com/office/word/2023/wordml/word16du" xmlns:w16="http://schemas.microsoft.com/office/word/2018/wordml" xmlns:w16cid="http://schemas.microsoft.com/office/word/2016/wordml/cid" xmlns:w16cex="http://schemas.microsoft.com/office/word/2018/wordml/cex" xmlns:oel="http://schemas.microsoft.com/office/2019/extlst" xmlns:am3d="http://schemas.microsoft.com/office/drawing/2017/model3d" xmlns:aink="http://schemas.microsoft.com/office/drawing/2016/ink" xmlns:cx8="http://schemas.microsoft.com/office/drawing/2016/5/14/chartex" xmlns:cx7="http://schemas.microsoft.com/office/drawing/2016/5/13/chartex" xmlns:cx6="http://schemas.microsoft.com/office/drawing/2016/5/12/chartex" xmlns:cx5="http://schemas.microsoft.com/office/drawing/2016/5/11/chartex" xmlns:cx4="http://schemas.microsoft.com/office/drawing/2016/5/10/chartex" xmlns:cx3="http://schemas.microsoft.com/office/drawing/2016/5/9/chartex" xmlns:cx2="http://schemas.microsoft.com/office/drawing/2015/10/21/chartex" xmlns:cx1="http://schemas.microsoft.com/office/drawing/2015/9/8/chartex">
+                <mc:Fallback xmlns:cx1="http://schemas.microsoft.com/office/drawing/2015/9/8/chartex" xmlns:cx2="http://schemas.microsoft.com/office/drawing/2015/10/21/chartex" xmlns:cx3="http://schemas.microsoft.com/office/drawing/2016/5/9/chartex" xmlns:cx4="http://schemas.microsoft.com/office/drawing/2016/5/10/chartex" xmlns:cx5="http://schemas.microsoft.com/office/drawing/2016/5/11/chartex" xmlns:cx6="http://schemas.microsoft.com/office/drawing/2016/5/12/chartex" xmlns:cx7="http://schemas.microsoft.com/office/drawing/2016/5/13/chartex" xmlns:cx8="http://schemas.microsoft.com/office/drawing/2016/5/14/chartex" xmlns:aink="http://schemas.microsoft.com/office/drawing/2016/ink" xmlns:am3d="http://schemas.microsoft.com/office/drawing/2017/model3d" xmlns:oel="http://schemas.microsoft.com/office/2019/extlst" xmlns:w16cex="http://schemas.microsoft.com/office/word/2018/wordml/cex" xmlns:w16cid="http://schemas.microsoft.com/office/word/2016/wordml/cid" xmlns:w16="http://schemas.microsoft.com/office/word/2018/wordml" xmlns:w16du="http://schemas.microsoft.com/office/word/2023/wordml/word16du" xmlns:w16sdtdh="http://schemas.microsoft.com/office/word/2020/wordml/sdtdatahash">
                   <w:pict>
                     <v:line w14:anchorId="23084E4B" id="Straight Connector 2" o:spid="_x0000_s1026" style="position:absolute;z-index:251665408;visibility:visible;mso-wrap-style:square;mso-width-percent:0;mso-wrap-distance-left:9pt;mso-wrap-distance-top:0;mso-wrap-distance-right:9pt;mso-wrap-distance-bottom:0;mso-position-horizontal:absolute;mso-position-horizontal-relative:text;mso-position-vertical:absolute;mso-position-vertical-relative:text;mso-width-percent:0;mso-width-relative:margin" from="77.8pt,18.65pt" to="162.1pt,18.65pt" o:gfxdata="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" strokecolor="black [3200]" strokeweight="1pt">
                       <v:stroke joinstyle="miter"/>
@@ -260,7 +260,7 @@
               </wp:anchor>
             </w:drawing>
           </mc:Choice>
-          <mc:Fallback xmlns:w16sdtdh="http://schemas.microsoft.com/office/word/2020/wordml/sdtdatahash" xmlns:w16du="http://schemas.microsoft.com/office/word/2023/wordml/word16du" xmlns:w16="http://schemas.microsoft.com/office/word/2018/wordml" xmlns:w16cid="http://schemas.microsoft.com/office/word/2016/wordml/cid" xmlns:w16cex="http://schemas.microsoft.com/office/word/2018/wordml/cex" xmlns:oel="http://schemas.microsoft.com/office/2019/extlst" xmlns:am3d="http://schemas.microsoft.com/office/drawing/2017/model3d" xmlns:aink="http://schemas.microsoft.com/office/drawing/2016/ink" xmlns:cx8="http://schemas.microsoft.com/office/drawing/2016/5/14/chartex" xmlns:cx7="http://schemas.microsoft.com/office/drawing/2016/5/13/chartex" xmlns:cx6="http://schemas.microsoft.com/office/drawing/2016/5/12/chartex" xmlns:cx5="http://schemas.microsoft.com/office/drawing/2016/5/11/chartex" xmlns:cx4="http://schemas.microsoft.com/office/drawing/2016/5/10/chartex" xmlns:cx3="http://schemas.microsoft.com/office/drawing/2016/5/9/chartex" xmlns:cx2="http://schemas.microsoft.com/office/drawing/2015/10/21/chartex" xmlns:cx1="http://schemas.microsoft.com/office/drawing/2015/9/8/chartex">
+          <mc:Fallback xmlns:cx1="http://schemas.microsoft.com/office/drawing/2015/9/8/chartex" xmlns:cx2="http://schemas.microsoft.com/office/drawing/2015/10/21/chartex" xmlns:cx3="http://schemas.microsoft.com/office/drawing/2016/5/9/chartex" xmlns:cx4="http://schemas.microsoft.com/office/drawing/2016/5/10/chartex" xmlns:cx5="http://schemas.microsoft.com/office/drawing/2016/5/11/chartex" xmlns:cx6="http://schemas.microsoft.com/office/drawing/2016/5/12/chartex" xmlns:cx7="http://schemas.microsoft.com/office/drawing/2016/5/13/chartex" xmlns:cx8="http://schemas.microsoft.com/office/drawing/2016/5/14/chartex" xmlns:aink="http://schemas.microsoft.com/office/drawing/2016/ink" xmlns:am3d="http://schemas.microsoft.com/office/drawing/2017/model3d" xmlns:oel="http://schemas.microsoft.com/office/2019/extlst" xmlns:w16cex="http://schemas.microsoft.com/office/word/2018/wordml/cex" xmlns:w16cid="http://schemas.microsoft.com/office/word/2016/wordml/cid" xmlns:w16="http://schemas.microsoft.com/office/word/2018/wordml" xmlns:w16du="http://schemas.microsoft.com/office/word/2023/wordml/word16du" xmlns:w16sdtdh="http://schemas.microsoft.com/office/word/2020/wordml/sdtdatahash">
             <w:pict>
               <v:line w14:anchorId="2588C48D" id="Straight Connector 1" o:spid="_x0000_s1026" style="position:absolute;z-index:251663360;visibility:visible;mso-wrap-style:square;mso-wrap-distance-left:9pt;mso-wrap-distance-top:0;mso-wrap-distance-right:9pt;mso-wrap-distance-bottom:0;mso-position-horizontal:absolute;mso-position-horizontal-relative:text;mso-position-vertical:absolute;mso-position-vertical-relative:text" from="45.85pt,4.5pt" to="165.7pt,4.5pt" o:gfxdata="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" strokecolor="black [3200]" strokeweight="1pt">
                 <v:stroke joinstyle="miter"/>
@@ -715,8 +715,6 @@
         </w:rPr>
         <w:t>Email</w:t>
       </w:r>
-      <w:bookmarkStart w:id="0" w:name="_GoBack"/>
-      <w:bookmarkEnd w:id="0"/>
       <w:r>
         <w:rPr>
           <w:bCs/>
@@ -4190,7 +4188,7 @@
                 <w:sz w:val="24"/>
                 <w:szCs w:val="24"/>
               </w:rPr>
-              <w:t>Chưa hoàn thành</w:t>
+              <w:t>Đã hoàn thành</w:t>
             </w:r>
           </w:p>
         </w:tc>
@@ -4315,7 +4313,7 @@
                 <w:sz w:val="24"/>
                 <w:szCs w:val="24"/>
               </w:rPr>
-              <w:t>Chưa hoàn thành</w:t>
+              <w:t>Đã hoàn thành</w:t>
             </w:r>
           </w:p>
         </w:tc>
@@ -4333,12 +4331,20 @@
                 <w:right w:val="nil"/>
                 <w:between w:val="nil"/>
               </w:pBdr>
-              <w:ind w:firstLine="720"/>
               <w:rPr>
                 <w:sz w:val="24"/>
                 <w:szCs w:val="24"/>
               </w:rPr>
             </w:pPr>
+            <w:r>
+              <w:rPr>
+                <w:sz w:val="24"/>
+                <w:szCs w:val="24"/>
+              </w:rPr>
+              <w:t>Còn hình ảnh NPC chưa vẽ</w:t>
+            </w:r>
+            <w:bookmarkStart w:id="0" w:name="_GoBack"/>
+            <w:bookmarkEnd w:id="0"/>
           </w:p>
         </w:tc>
       </w:tr>

</xml_diff>

<commit_message>
Update Đề cương đồ án_6051071073_PhamHieuMinh.docx
</commit_message>
<xml_diff>
--- a/Đề cương đồ án_6051071073_PhamHieuMinh.docx
+++ b/Đề cương đồ án_6051071073_PhamHieuMinh.docx
@@ -174,7 +174,7 @@
                     </wp:anchor>
                   </w:drawing>
                 </mc:Choice>
-                <mc:Fallback xmlns:cx1="http://schemas.microsoft.com/office/drawing/2015/9/8/chartex" xmlns:cx2="http://schemas.microsoft.com/office/drawing/2015/10/21/chartex" xmlns:cx3="http://schemas.microsoft.com/office/drawing/2016/5/9/chartex" xmlns:cx4="http://schemas.microsoft.com/office/drawing/2016/5/10/chartex" xmlns:cx5="http://schemas.microsoft.com/office/drawing/2016/5/11/chartex" xmlns:cx6="http://schemas.microsoft.com/office/drawing/2016/5/12/chartex" xmlns:cx7="http://schemas.microsoft.com/office/drawing/2016/5/13/chartex" xmlns:cx8="http://schemas.microsoft.com/office/drawing/2016/5/14/chartex" xmlns:aink="http://schemas.microsoft.com/office/drawing/2016/ink" xmlns:am3d="http://schemas.microsoft.com/office/drawing/2017/model3d" xmlns:oel="http://schemas.microsoft.com/office/2019/extlst" xmlns:w16cex="http://schemas.microsoft.com/office/word/2018/wordml/cex" xmlns:w16cid="http://schemas.microsoft.com/office/word/2016/wordml/cid" xmlns:w16="http://schemas.microsoft.com/office/word/2018/wordml" xmlns:w16du="http://schemas.microsoft.com/office/word/2023/wordml/word16du" xmlns:w16sdtdh="http://schemas.microsoft.com/office/word/2020/wordml/sdtdatahash">
+                <mc:Fallback xmlns:w16sdtdh="http://schemas.microsoft.com/office/word/2020/wordml/sdtdatahash" xmlns:w16du="http://schemas.microsoft.com/office/word/2023/wordml/word16du" xmlns:w16="http://schemas.microsoft.com/office/word/2018/wordml" xmlns:w16cid="http://schemas.microsoft.com/office/word/2016/wordml/cid" xmlns:w16cex="http://schemas.microsoft.com/office/word/2018/wordml/cex" xmlns:oel="http://schemas.microsoft.com/office/2019/extlst" xmlns:am3d="http://schemas.microsoft.com/office/drawing/2017/model3d" xmlns:aink="http://schemas.microsoft.com/office/drawing/2016/ink" xmlns:cx8="http://schemas.microsoft.com/office/drawing/2016/5/14/chartex" xmlns:cx7="http://schemas.microsoft.com/office/drawing/2016/5/13/chartex" xmlns:cx6="http://schemas.microsoft.com/office/drawing/2016/5/12/chartex" xmlns:cx5="http://schemas.microsoft.com/office/drawing/2016/5/11/chartex" xmlns:cx4="http://schemas.microsoft.com/office/drawing/2016/5/10/chartex" xmlns:cx3="http://schemas.microsoft.com/office/drawing/2016/5/9/chartex" xmlns:cx2="http://schemas.microsoft.com/office/drawing/2015/10/21/chartex" xmlns:cx1="http://schemas.microsoft.com/office/drawing/2015/9/8/chartex">
                   <w:pict>
                     <v:line w14:anchorId="23084E4B" id="Straight Connector 2" o:spid="_x0000_s1026" style="position:absolute;z-index:251665408;visibility:visible;mso-wrap-style:square;mso-width-percent:0;mso-wrap-distance-left:9pt;mso-wrap-distance-top:0;mso-wrap-distance-right:9pt;mso-wrap-distance-bottom:0;mso-position-horizontal:absolute;mso-position-horizontal-relative:text;mso-position-vertical:absolute;mso-position-vertical-relative:text;mso-width-percent:0;mso-width-relative:margin" from="77.8pt,18.65pt" to="162.1pt,18.65pt" o:gfxdata="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" strokecolor="black [3200]" strokeweight="1pt">
                       <v:stroke joinstyle="miter"/>
@@ -260,7 +260,7 @@
               </wp:anchor>
             </w:drawing>
           </mc:Choice>
-          <mc:Fallback xmlns:cx1="http://schemas.microsoft.com/office/drawing/2015/9/8/chartex" xmlns:cx2="http://schemas.microsoft.com/office/drawing/2015/10/21/chartex" xmlns:cx3="http://schemas.microsoft.com/office/drawing/2016/5/9/chartex" xmlns:cx4="http://schemas.microsoft.com/office/drawing/2016/5/10/chartex" xmlns:cx5="http://schemas.microsoft.com/office/drawing/2016/5/11/chartex" xmlns:cx6="http://schemas.microsoft.com/office/drawing/2016/5/12/chartex" xmlns:cx7="http://schemas.microsoft.com/office/drawing/2016/5/13/chartex" xmlns:cx8="http://schemas.microsoft.com/office/drawing/2016/5/14/chartex" xmlns:aink="http://schemas.microsoft.com/office/drawing/2016/ink" xmlns:am3d="http://schemas.microsoft.com/office/drawing/2017/model3d" xmlns:oel="http://schemas.microsoft.com/office/2019/extlst" xmlns:w16cex="http://schemas.microsoft.com/office/word/2018/wordml/cex" xmlns:w16cid="http://schemas.microsoft.com/office/word/2016/wordml/cid" xmlns:w16="http://schemas.microsoft.com/office/word/2018/wordml" xmlns:w16du="http://schemas.microsoft.com/office/word/2023/wordml/word16du" xmlns:w16sdtdh="http://schemas.microsoft.com/office/word/2020/wordml/sdtdatahash">
+          <mc:Fallback xmlns:w16sdtdh="http://schemas.microsoft.com/office/word/2020/wordml/sdtdatahash" xmlns:w16du="http://schemas.microsoft.com/office/word/2023/wordml/word16du" xmlns:w16="http://schemas.microsoft.com/office/word/2018/wordml" xmlns:w16cid="http://schemas.microsoft.com/office/word/2016/wordml/cid" xmlns:w16cex="http://schemas.microsoft.com/office/word/2018/wordml/cex" xmlns:oel="http://schemas.microsoft.com/office/2019/extlst" xmlns:am3d="http://schemas.microsoft.com/office/drawing/2017/model3d" xmlns:aink="http://schemas.microsoft.com/office/drawing/2016/ink" xmlns:cx8="http://schemas.microsoft.com/office/drawing/2016/5/14/chartex" xmlns:cx7="http://schemas.microsoft.com/office/drawing/2016/5/13/chartex" xmlns:cx6="http://schemas.microsoft.com/office/drawing/2016/5/12/chartex" xmlns:cx5="http://schemas.microsoft.com/office/drawing/2016/5/11/chartex" xmlns:cx4="http://schemas.microsoft.com/office/drawing/2016/5/10/chartex" xmlns:cx3="http://schemas.microsoft.com/office/drawing/2016/5/9/chartex" xmlns:cx2="http://schemas.microsoft.com/office/drawing/2015/10/21/chartex" xmlns:cx1="http://schemas.microsoft.com/office/drawing/2015/9/8/chartex">
             <w:pict>
               <v:line w14:anchorId="2588C48D" id="Straight Connector 1" o:spid="_x0000_s1026" style="position:absolute;z-index:251663360;visibility:visible;mso-wrap-style:square;mso-wrap-distance-left:9pt;mso-wrap-distance-top:0;mso-wrap-distance-right:9pt;mso-wrap-distance-bottom:0;mso-position-horizontal:absolute;mso-position-horizontal-relative:text;mso-position-vertical:absolute;mso-position-vertical-relative:text" from="45.85pt,4.5pt" to="165.7pt,4.5pt" o:gfxdata="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" strokecolor="black [3200]" strokeweight="1pt">
                 <v:stroke joinstyle="miter"/>
@@ -4343,8 +4343,6 @@
               </w:rPr>
               <w:t>Còn hình ảnh NPC chưa vẽ</w:t>
             </w:r>
-            <w:bookmarkStart w:id="0" w:name="_GoBack"/>
-            <w:bookmarkEnd w:id="0"/>
           </w:p>
         </w:tc>
       </w:tr>
@@ -4446,8 +4444,10 @@
                 <w:sz w:val="24"/>
                 <w:szCs w:val="24"/>
               </w:rPr>
-              <w:t>Chưa hoàn thành</w:t>
+              <w:t>Đã hoàn thành</w:t>
             </w:r>
+            <w:bookmarkStart w:id="0" w:name="_GoBack"/>
+            <w:bookmarkEnd w:id="0"/>
           </w:p>
         </w:tc>
         <w:tc>

</xml_diff>

<commit_message>
adding quest system, upgrade several things
upgrade harvesting system, upgrade plant , adding quest chain system
</commit_message>
<xml_diff>
--- a/Đề cương đồ án_6051071073_PhamHieuMinh.docx
+++ b/Đề cương đồ án_6051071073_PhamHieuMinh.docx
@@ -174,7 +174,7 @@
                     </wp:anchor>
                   </w:drawing>
                 </mc:Choice>
-                <mc:Fallback xmlns:w16sdtdh="http://schemas.microsoft.com/office/word/2020/wordml/sdtdatahash" xmlns:w16du="http://schemas.microsoft.com/office/word/2023/wordml/word16du" xmlns:w16="http://schemas.microsoft.com/office/word/2018/wordml" xmlns:w16cid="http://schemas.microsoft.com/office/word/2016/wordml/cid" xmlns:w16cex="http://schemas.microsoft.com/office/word/2018/wordml/cex" xmlns:oel="http://schemas.microsoft.com/office/2019/extlst" xmlns:am3d="http://schemas.microsoft.com/office/drawing/2017/model3d" xmlns:aink="http://schemas.microsoft.com/office/drawing/2016/ink" xmlns:cx8="http://schemas.microsoft.com/office/drawing/2016/5/14/chartex" xmlns:cx7="http://schemas.microsoft.com/office/drawing/2016/5/13/chartex" xmlns:cx6="http://schemas.microsoft.com/office/drawing/2016/5/12/chartex" xmlns:cx5="http://schemas.microsoft.com/office/drawing/2016/5/11/chartex" xmlns:cx4="http://schemas.microsoft.com/office/drawing/2016/5/10/chartex" xmlns:cx3="http://schemas.microsoft.com/office/drawing/2016/5/9/chartex" xmlns:cx2="http://schemas.microsoft.com/office/drawing/2015/10/21/chartex" xmlns:cx1="http://schemas.microsoft.com/office/drawing/2015/9/8/chartex">
+                <mc:Fallback xmlns:cx1="http://schemas.microsoft.com/office/drawing/2015/9/8/chartex" xmlns:cx2="http://schemas.microsoft.com/office/drawing/2015/10/21/chartex" xmlns:cx3="http://schemas.microsoft.com/office/drawing/2016/5/9/chartex" xmlns:cx4="http://schemas.microsoft.com/office/drawing/2016/5/10/chartex" xmlns:cx5="http://schemas.microsoft.com/office/drawing/2016/5/11/chartex" xmlns:cx6="http://schemas.microsoft.com/office/drawing/2016/5/12/chartex" xmlns:cx7="http://schemas.microsoft.com/office/drawing/2016/5/13/chartex" xmlns:cx8="http://schemas.microsoft.com/office/drawing/2016/5/14/chartex" xmlns:aink="http://schemas.microsoft.com/office/drawing/2016/ink" xmlns:am3d="http://schemas.microsoft.com/office/drawing/2017/model3d" xmlns:oel="http://schemas.microsoft.com/office/2019/extlst" xmlns:w16cex="http://schemas.microsoft.com/office/word/2018/wordml/cex" xmlns:w16cid="http://schemas.microsoft.com/office/word/2016/wordml/cid" xmlns:w16="http://schemas.microsoft.com/office/word/2018/wordml" xmlns:w16du="http://schemas.microsoft.com/office/word/2023/wordml/word16du" xmlns:w16sdtdh="http://schemas.microsoft.com/office/word/2020/wordml/sdtdatahash">
                   <w:pict>
                     <v:line w14:anchorId="23084E4B" id="Straight Connector 2" o:spid="_x0000_s1026" style="position:absolute;z-index:251665408;visibility:visible;mso-wrap-style:square;mso-width-percent:0;mso-wrap-distance-left:9pt;mso-wrap-distance-top:0;mso-wrap-distance-right:9pt;mso-wrap-distance-bottom:0;mso-position-horizontal:absolute;mso-position-horizontal-relative:text;mso-position-vertical:absolute;mso-position-vertical-relative:text;mso-width-percent:0;mso-width-relative:margin" from="77.8pt,18.65pt" to="162.1pt,18.65pt" o:gfxdata="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" strokecolor="black [3200]" strokeweight="1pt">
                       <v:stroke joinstyle="miter"/>
@@ -260,7 +260,7 @@
               </wp:anchor>
             </w:drawing>
           </mc:Choice>
-          <mc:Fallback xmlns:w16sdtdh="http://schemas.microsoft.com/office/word/2020/wordml/sdtdatahash" xmlns:w16du="http://schemas.microsoft.com/office/word/2023/wordml/word16du" xmlns:w16="http://schemas.microsoft.com/office/word/2018/wordml" xmlns:w16cid="http://schemas.microsoft.com/office/word/2016/wordml/cid" xmlns:w16cex="http://schemas.microsoft.com/office/word/2018/wordml/cex" xmlns:oel="http://schemas.microsoft.com/office/2019/extlst" xmlns:am3d="http://schemas.microsoft.com/office/drawing/2017/model3d" xmlns:aink="http://schemas.microsoft.com/office/drawing/2016/ink" xmlns:cx8="http://schemas.microsoft.com/office/drawing/2016/5/14/chartex" xmlns:cx7="http://schemas.microsoft.com/office/drawing/2016/5/13/chartex" xmlns:cx6="http://schemas.microsoft.com/office/drawing/2016/5/12/chartex" xmlns:cx5="http://schemas.microsoft.com/office/drawing/2016/5/11/chartex" xmlns:cx4="http://schemas.microsoft.com/office/drawing/2016/5/10/chartex" xmlns:cx3="http://schemas.microsoft.com/office/drawing/2016/5/9/chartex" xmlns:cx2="http://schemas.microsoft.com/office/drawing/2015/10/21/chartex" xmlns:cx1="http://schemas.microsoft.com/office/drawing/2015/9/8/chartex">
+          <mc:Fallback xmlns:cx1="http://schemas.microsoft.com/office/drawing/2015/9/8/chartex" xmlns:cx2="http://schemas.microsoft.com/office/drawing/2015/10/21/chartex" xmlns:cx3="http://schemas.microsoft.com/office/drawing/2016/5/9/chartex" xmlns:cx4="http://schemas.microsoft.com/office/drawing/2016/5/10/chartex" xmlns:cx5="http://schemas.microsoft.com/office/drawing/2016/5/11/chartex" xmlns:cx6="http://schemas.microsoft.com/office/drawing/2016/5/12/chartex" xmlns:cx7="http://schemas.microsoft.com/office/drawing/2016/5/13/chartex" xmlns:cx8="http://schemas.microsoft.com/office/drawing/2016/5/14/chartex" xmlns:aink="http://schemas.microsoft.com/office/drawing/2016/ink" xmlns:am3d="http://schemas.microsoft.com/office/drawing/2017/model3d" xmlns:oel="http://schemas.microsoft.com/office/2019/extlst" xmlns:w16cex="http://schemas.microsoft.com/office/word/2018/wordml/cex" xmlns:w16cid="http://schemas.microsoft.com/office/word/2016/wordml/cid" xmlns:w16="http://schemas.microsoft.com/office/word/2018/wordml" xmlns:w16du="http://schemas.microsoft.com/office/word/2023/wordml/word16du" xmlns:w16sdtdh="http://schemas.microsoft.com/office/word/2020/wordml/sdtdatahash">
             <w:pict>
               <v:line w14:anchorId="2588C48D" id="Straight Connector 1" o:spid="_x0000_s1026" style="position:absolute;z-index:251663360;visibility:visible;mso-wrap-style:square;mso-wrap-distance-left:9pt;mso-wrap-distance-top:0;mso-wrap-distance-right:9pt;mso-wrap-distance-bottom:0;mso-position-horizontal:absolute;mso-position-horizontal-relative:text;mso-position-vertical:absolute;mso-position-vertical-relative:text" from="45.85pt,4.5pt" to="165.7pt,4.5pt" o:gfxdata="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" strokecolor="black [3200]" strokeweight="1pt">
                 <v:stroke joinstyle="miter"/>
@@ -4446,8 +4446,6 @@
               </w:rPr>
               <w:t>Đã hoàn thành</w:t>
             </w:r>
-            <w:bookmarkStart w:id="0" w:name="_GoBack"/>
-            <w:bookmarkEnd w:id="0"/>
           </w:p>
         </w:tc>
         <w:tc>
@@ -4566,6 +4564,7 @@
                 <w:szCs w:val="24"/>
               </w:rPr>
             </w:pPr>
+            <w:bookmarkStart w:id="0" w:name="_GoBack"/>
             <w:r>
               <w:rPr>
                 <w:sz w:val="24"/>
@@ -4573,6 +4572,7 @@
               </w:rPr>
               <w:t>Chưa hoàn thành</w:t>
             </w:r>
+            <w:bookmarkEnd w:id="0"/>
           </w:p>
         </w:tc>
         <w:tc>
@@ -4589,7 +4589,6 @@
                 <w:right w:val="nil"/>
                 <w:between w:val="nil"/>
               </w:pBdr>
-              <w:ind w:firstLine="720"/>
               <w:rPr>
                 <w:sz w:val="24"/>
                 <w:szCs w:val="24"/>

</xml_diff>

<commit_message>
fixing chicken , change final proposal
</commit_message>
<xml_diff>
--- a/Đề cương đồ án_6051071073_PhamHieuMinh.docx
+++ b/Đề cương đồ án_6051071073_PhamHieuMinh.docx
@@ -174,7 +174,7 @@
                     </wp:anchor>
                   </w:drawing>
                 </mc:Choice>
-                <mc:Fallback xmlns:w16sdtdh="http://schemas.microsoft.com/office/word/2020/wordml/sdtdatahash" xmlns:w16du="http://schemas.microsoft.com/office/word/2023/wordml/word16du" xmlns:w16="http://schemas.microsoft.com/office/word/2018/wordml" xmlns:w16cid="http://schemas.microsoft.com/office/word/2016/wordml/cid" xmlns:w16cex="http://schemas.microsoft.com/office/word/2018/wordml/cex" xmlns:oel="http://schemas.microsoft.com/office/2019/extlst" xmlns:am3d="http://schemas.microsoft.com/office/drawing/2017/model3d" xmlns:aink="http://schemas.microsoft.com/office/drawing/2016/ink" xmlns:cx8="http://schemas.microsoft.com/office/drawing/2016/5/14/chartex" xmlns:cx7="http://schemas.microsoft.com/office/drawing/2016/5/13/chartex" xmlns:cx6="http://schemas.microsoft.com/office/drawing/2016/5/12/chartex" xmlns:cx5="http://schemas.microsoft.com/office/drawing/2016/5/11/chartex" xmlns:cx4="http://schemas.microsoft.com/office/drawing/2016/5/10/chartex" xmlns:cx3="http://schemas.microsoft.com/office/drawing/2016/5/9/chartex" xmlns:cx2="http://schemas.microsoft.com/office/drawing/2015/10/21/chartex" xmlns:cx1="http://schemas.microsoft.com/office/drawing/2015/9/8/chartex">
+                <mc:Fallback xmlns:cx1="http://schemas.microsoft.com/office/drawing/2015/9/8/chartex" xmlns:cx2="http://schemas.microsoft.com/office/drawing/2015/10/21/chartex" xmlns:cx3="http://schemas.microsoft.com/office/drawing/2016/5/9/chartex" xmlns:cx4="http://schemas.microsoft.com/office/drawing/2016/5/10/chartex" xmlns:cx5="http://schemas.microsoft.com/office/drawing/2016/5/11/chartex" xmlns:cx6="http://schemas.microsoft.com/office/drawing/2016/5/12/chartex" xmlns:cx7="http://schemas.microsoft.com/office/drawing/2016/5/13/chartex" xmlns:cx8="http://schemas.microsoft.com/office/drawing/2016/5/14/chartex" xmlns:aink="http://schemas.microsoft.com/office/drawing/2016/ink" xmlns:am3d="http://schemas.microsoft.com/office/drawing/2017/model3d" xmlns:oel="http://schemas.microsoft.com/office/2019/extlst" xmlns:w16cex="http://schemas.microsoft.com/office/word/2018/wordml/cex" xmlns:w16cid="http://schemas.microsoft.com/office/word/2016/wordml/cid" xmlns:w16="http://schemas.microsoft.com/office/word/2018/wordml" xmlns:w16du="http://schemas.microsoft.com/office/word/2023/wordml/word16du" xmlns:w16sdtdh="http://schemas.microsoft.com/office/word/2020/wordml/sdtdatahash">
                   <w:pict>
                     <v:line w14:anchorId="23084E4B" id="Straight Connector 2" o:spid="_x0000_s1026" style="position:absolute;z-index:251665408;visibility:visible;mso-wrap-style:square;mso-width-percent:0;mso-wrap-distance-left:9pt;mso-wrap-distance-top:0;mso-wrap-distance-right:9pt;mso-wrap-distance-bottom:0;mso-position-horizontal:absolute;mso-position-horizontal-relative:text;mso-position-vertical:absolute;mso-position-vertical-relative:text;mso-width-percent:0;mso-width-relative:margin" from="77.8pt,18.65pt" to="162.1pt,18.65pt" o:gfxdata="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" strokecolor="black [3200]" strokeweight="1pt">
                       <v:stroke joinstyle="miter"/>
@@ -260,7 +260,7 @@
               </wp:anchor>
             </w:drawing>
           </mc:Choice>
-          <mc:Fallback xmlns:w16sdtdh="http://schemas.microsoft.com/office/word/2020/wordml/sdtdatahash" xmlns:w16du="http://schemas.microsoft.com/office/word/2023/wordml/word16du" xmlns:w16="http://schemas.microsoft.com/office/word/2018/wordml" xmlns:w16cid="http://schemas.microsoft.com/office/word/2016/wordml/cid" xmlns:w16cex="http://schemas.microsoft.com/office/word/2018/wordml/cex" xmlns:oel="http://schemas.microsoft.com/office/2019/extlst" xmlns:am3d="http://schemas.microsoft.com/office/drawing/2017/model3d" xmlns:aink="http://schemas.microsoft.com/office/drawing/2016/ink" xmlns:cx8="http://schemas.microsoft.com/office/drawing/2016/5/14/chartex" xmlns:cx7="http://schemas.microsoft.com/office/drawing/2016/5/13/chartex" xmlns:cx6="http://schemas.microsoft.com/office/drawing/2016/5/12/chartex" xmlns:cx5="http://schemas.microsoft.com/office/drawing/2016/5/11/chartex" xmlns:cx4="http://schemas.microsoft.com/office/drawing/2016/5/10/chartex" xmlns:cx3="http://schemas.microsoft.com/office/drawing/2016/5/9/chartex" xmlns:cx2="http://schemas.microsoft.com/office/drawing/2015/10/21/chartex" xmlns:cx1="http://schemas.microsoft.com/office/drawing/2015/9/8/chartex">
+          <mc:Fallback xmlns:cx1="http://schemas.microsoft.com/office/drawing/2015/9/8/chartex" xmlns:cx2="http://schemas.microsoft.com/office/drawing/2015/10/21/chartex" xmlns:cx3="http://schemas.microsoft.com/office/drawing/2016/5/9/chartex" xmlns:cx4="http://schemas.microsoft.com/office/drawing/2016/5/10/chartex" xmlns:cx5="http://schemas.microsoft.com/office/drawing/2016/5/11/chartex" xmlns:cx6="http://schemas.microsoft.com/office/drawing/2016/5/12/chartex" xmlns:cx7="http://schemas.microsoft.com/office/drawing/2016/5/13/chartex" xmlns:cx8="http://schemas.microsoft.com/office/drawing/2016/5/14/chartex" xmlns:aink="http://schemas.microsoft.com/office/drawing/2016/ink" xmlns:am3d="http://schemas.microsoft.com/office/drawing/2017/model3d" xmlns:oel="http://schemas.microsoft.com/office/2019/extlst" xmlns:w16cex="http://schemas.microsoft.com/office/word/2018/wordml/cex" xmlns:w16cid="http://schemas.microsoft.com/office/word/2016/wordml/cid" xmlns:w16="http://schemas.microsoft.com/office/word/2018/wordml" xmlns:w16du="http://schemas.microsoft.com/office/word/2023/wordml/word16du" xmlns:w16sdtdh="http://schemas.microsoft.com/office/word/2020/wordml/sdtdatahash">
             <w:pict>
               <v:line w14:anchorId="2588C48D" id="Straight Connector 1" o:spid="_x0000_s1026" style="position:absolute;z-index:251663360;visibility:visible;mso-wrap-style:square;mso-wrap-distance-left:9pt;mso-wrap-distance-top:0;mso-wrap-distance-right:9pt;mso-wrap-distance-bottom:0;mso-position-horizontal:absolute;mso-position-horizontal-relative:text;mso-position-vertical:absolute;mso-position-vertical-relative:text" from="45.85pt,4.5pt" to="165.7pt,4.5pt" o:gfxdata="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" strokecolor="black [3200]" strokeweight="1pt">
                 <v:stroke joinstyle="miter"/>
@@ -3841,7 +3841,6 @@
                 <w:szCs w:val="24"/>
               </w:rPr>
             </w:pPr>
-            <w:bookmarkStart w:id="0" w:name="_GoBack"/>
             <w:r>
               <w:rPr>
                 <w:sz w:val="24"/>
@@ -3966,7 +3965,6 @@
           </w:p>
         </w:tc>
       </w:tr>
-      <w:bookmarkEnd w:id="0"/>
       <w:tr>
         <w:trPr>
           <w:trHeight w:val="275"/>
@@ -4640,6 +4638,410 @@
                 <w:szCs w:val="24"/>
               </w:rPr>
               <w:t>Tuần 10 (22/12 - 28/12)</w:t>
+            </w:r>
+          </w:p>
+        </w:tc>
+        <w:tc>
+          <w:tcPr>
+            <w:tcW w:w="3150" w:type="dxa"/>
+            <w:shd w:val="clear" w:color="auto" w:fill="auto"/>
+            <w:tcMar>
+              <w:top w:w="100" w:type="dxa"/>
+              <w:left w:w="100" w:type="dxa"/>
+              <w:bottom w:w="100" w:type="dxa"/>
+              <w:right w:w="100" w:type="dxa"/>
+            </w:tcMar>
+          </w:tcPr>
+          <w:p>
+            <w:pPr>
+              <w:widowControl w:val="0"/>
+              <w:pBdr>
+                <w:top w:val="nil"/>
+                <w:left w:val="nil"/>
+                <w:bottom w:val="nil"/>
+                <w:right w:val="nil"/>
+                <w:between w:val="nil"/>
+              </w:pBdr>
+              <w:rPr>
+                <w:sz w:val="24"/>
+                <w:szCs w:val="24"/>
+              </w:rPr>
+            </w:pPr>
+            <w:r>
+              <w:rPr>
+                <w:sz w:val="24"/>
+                <w:szCs w:val="24"/>
+              </w:rPr>
+              <w:t>Thêm hệ thống thể lực cho game</w:t>
+            </w:r>
+          </w:p>
+        </w:tc>
+        <w:tc>
+          <w:tcPr>
+            <w:tcW w:w="1530" w:type="dxa"/>
+          </w:tcPr>
+          <w:p>
+            <w:pPr>
+              <w:widowControl w:val="0"/>
+              <w:pBdr>
+                <w:top w:val="nil"/>
+                <w:left w:val="nil"/>
+                <w:bottom w:val="nil"/>
+                <w:right w:val="nil"/>
+                <w:between w:val="nil"/>
+              </w:pBdr>
+              <w:rPr>
+                <w:sz w:val="24"/>
+                <w:szCs w:val="24"/>
+              </w:rPr>
+            </w:pPr>
+            <w:r>
+              <w:rPr>
+                <w:sz w:val="24"/>
+                <w:szCs w:val="24"/>
+              </w:rPr>
+              <w:t>Đã hoàn thành</w:t>
+            </w:r>
+          </w:p>
+        </w:tc>
+        <w:tc>
+          <w:tcPr>
+            <w:tcW w:w="1530" w:type="dxa"/>
+          </w:tcPr>
+          <w:p>
+            <w:pPr>
+              <w:widowControl w:val="0"/>
+              <w:pBdr>
+                <w:top w:val="nil"/>
+                <w:left w:val="nil"/>
+                <w:bottom w:val="nil"/>
+                <w:right w:val="nil"/>
+                <w:between w:val="nil"/>
+              </w:pBdr>
+              <w:rPr>
+                <w:sz w:val="24"/>
+                <w:szCs w:val="24"/>
+              </w:rPr>
+            </w:pPr>
+            <w:r>
+              <w:rPr>
+                <w:sz w:val="24"/>
+                <w:szCs w:val="24"/>
+              </w:rPr>
+              <w:t>Nâng cấp thêm</w:t>
+            </w:r>
+          </w:p>
+        </w:tc>
+      </w:tr>
+      <w:tr>
+        <w:trPr>
+          <w:trHeight w:val="275"/>
+        </w:trPr>
+        <w:tc>
+          <w:tcPr>
+            <w:tcW w:w="1530" w:type="dxa"/>
+            <w:shd w:val="clear" w:color="auto" w:fill="auto"/>
+            <w:tcMar>
+              <w:top w:w="100" w:type="dxa"/>
+              <w:left w:w="100" w:type="dxa"/>
+              <w:bottom w:w="100" w:type="dxa"/>
+              <w:right w:w="100" w:type="dxa"/>
+            </w:tcMar>
+          </w:tcPr>
+          <w:p>
+            <w:pPr>
+              <w:widowControl w:val="0"/>
+              <w:pBdr>
+                <w:top w:val="nil"/>
+                <w:left w:val="nil"/>
+                <w:bottom w:val="nil"/>
+                <w:right w:val="nil"/>
+                <w:between w:val="nil"/>
+              </w:pBdr>
+              <w:rPr>
+                <w:sz w:val="24"/>
+                <w:szCs w:val="24"/>
+              </w:rPr>
+            </w:pPr>
+            <w:r>
+              <w:rPr>
+                <w:sz w:val="24"/>
+                <w:szCs w:val="24"/>
+              </w:rPr>
+              <w:t>Tuần 1</w:t>
+            </w:r>
+            <w:r>
+              <w:rPr>
+                <w:sz w:val="24"/>
+                <w:szCs w:val="24"/>
+              </w:rPr>
+              <w:t>1</w:t>
+            </w:r>
+            <w:r>
+              <w:rPr>
+                <w:sz w:val="24"/>
+                <w:szCs w:val="24"/>
+              </w:rPr>
+              <w:t xml:space="preserve"> (2</w:t>
+            </w:r>
+            <w:r>
+              <w:rPr>
+                <w:sz w:val="24"/>
+                <w:szCs w:val="24"/>
+              </w:rPr>
+              <w:t>9</w:t>
+            </w:r>
+            <w:r>
+              <w:rPr>
+                <w:sz w:val="24"/>
+                <w:szCs w:val="24"/>
+              </w:rPr>
+              <w:t xml:space="preserve">/12 </w:t>
+            </w:r>
+            <w:r>
+              <w:rPr>
+                <w:sz w:val="24"/>
+                <w:szCs w:val="24"/>
+              </w:rPr>
+              <w:t>–</w:t>
+            </w:r>
+            <w:r>
+              <w:rPr>
+                <w:sz w:val="24"/>
+                <w:szCs w:val="24"/>
+              </w:rPr>
+              <w:t xml:space="preserve"> </w:t>
+            </w:r>
+            <w:r>
+              <w:rPr>
+                <w:sz w:val="24"/>
+                <w:szCs w:val="24"/>
+              </w:rPr>
+              <w:t>04/01</w:t>
+            </w:r>
+            <w:r>
+              <w:rPr>
+                <w:sz w:val="24"/>
+                <w:szCs w:val="24"/>
+              </w:rPr>
+              <w:t>)</w:t>
+            </w:r>
+          </w:p>
+        </w:tc>
+        <w:tc>
+          <w:tcPr>
+            <w:tcW w:w="3150" w:type="dxa"/>
+            <w:shd w:val="clear" w:color="auto" w:fill="auto"/>
+            <w:tcMar>
+              <w:top w:w="100" w:type="dxa"/>
+              <w:left w:w="100" w:type="dxa"/>
+              <w:bottom w:w="100" w:type="dxa"/>
+              <w:right w:w="100" w:type="dxa"/>
+            </w:tcMar>
+          </w:tcPr>
+          <w:p>
+            <w:pPr>
+              <w:widowControl w:val="0"/>
+              <w:pBdr>
+                <w:top w:val="nil"/>
+                <w:left w:val="nil"/>
+                <w:bottom w:val="nil"/>
+                <w:right w:val="nil"/>
+                <w:between w:val="nil"/>
+              </w:pBdr>
+              <w:rPr>
+                <w:sz w:val="24"/>
+                <w:szCs w:val="24"/>
+              </w:rPr>
+            </w:pPr>
+            <w:r>
+              <w:rPr>
+                <w:sz w:val="24"/>
+                <w:szCs w:val="24"/>
+              </w:rPr>
+              <w:t xml:space="preserve">Thêm </w:t>
+            </w:r>
+            <w:r>
+              <w:rPr>
+                <w:sz w:val="24"/>
+                <w:szCs w:val="24"/>
+              </w:rPr>
+              <w:t>hệ thông hiệu ứng tác dụng xấu cho nhân vật</w:t>
+            </w:r>
+          </w:p>
+        </w:tc>
+        <w:tc>
+          <w:tcPr>
+            <w:tcW w:w="1530" w:type="dxa"/>
+          </w:tcPr>
+          <w:p>
+            <w:pPr>
+              <w:widowControl w:val="0"/>
+              <w:pBdr>
+                <w:top w:val="nil"/>
+                <w:left w:val="nil"/>
+                <w:bottom w:val="nil"/>
+                <w:right w:val="nil"/>
+                <w:between w:val="nil"/>
+              </w:pBdr>
+              <w:rPr>
+                <w:sz w:val="24"/>
+                <w:szCs w:val="24"/>
+              </w:rPr>
+            </w:pPr>
+            <w:r>
+              <w:rPr>
+                <w:sz w:val="24"/>
+                <w:szCs w:val="24"/>
+              </w:rPr>
+              <w:t>Đã hoàn thành</w:t>
+            </w:r>
+            <w:bookmarkStart w:id="0" w:name="_GoBack"/>
+            <w:bookmarkEnd w:id="0"/>
+          </w:p>
+        </w:tc>
+        <w:tc>
+          <w:tcPr>
+            <w:tcW w:w="1530" w:type="dxa"/>
+          </w:tcPr>
+          <w:p>
+            <w:pPr>
+              <w:widowControl w:val="0"/>
+              <w:pBdr>
+                <w:top w:val="nil"/>
+                <w:left w:val="nil"/>
+                <w:bottom w:val="nil"/>
+                <w:right w:val="nil"/>
+                <w:between w:val="nil"/>
+              </w:pBdr>
+              <w:rPr>
+                <w:sz w:val="24"/>
+                <w:szCs w:val="24"/>
+              </w:rPr>
+            </w:pPr>
+            <w:r>
+              <w:rPr>
+                <w:sz w:val="24"/>
+                <w:szCs w:val="24"/>
+              </w:rPr>
+              <w:t>Nâng cấp thêm</w:t>
+            </w:r>
+          </w:p>
+        </w:tc>
+      </w:tr>
+      <w:tr>
+        <w:trPr>
+          <w:trHeight w:val="275"/>
+        </w:trPr>
+        <w:tc>
+          <w:tcPr>
+            <w:tcW w:w="1530" w:type="dxa"/>
+            <w:shd w:val="clear" w:color="auto" w:fill="auto"/>
+            <w:tcMar>
+              <w:top w:w="100" w:type="dxa"/>
+              <w:left w:w="100" w:type="dxa"/>
+              <w:bottom w:w="100" w:type="dxa"/>
+              <w:right w:w="100" w:type="dxa"/>
+            </w:tcMar>
+          </w:tcPr>
+          <w:p>
+            <w:pPr>
+              <w:widowControl w:val="0"/>
+              <w:pBdr>
+                <w:top w:val="nil"/>
+                <w:left w:val="nil"/>
+                <w:bottom w:val="nil"/>
+                <w:right w:val="nil"/>
+                <w:between w:val="nil"/>
+              </w:pBdr>
+              <w:rPr>
+                <w:sz w:val="24"/>
+                <w:szCs w:val="24"/>
+              </w:rPr>
+            </w:pPr>
+            <w:r>
+              <w:rPr>
+                <w:sz w:val="24"/>
+                <w:szCs w:val="24"/>
+              </w:rPr>
+              <w:t>Tuần 1</w:t>
+            </w:r>
+            <w:r>
+              <w:rPr>
+                <w:sz w:val="24"/>
+                <w:szCs w:val="24"/>
+              </w:rPr>
+              <w:t>1</w:t>
+            </w:r>
+            <w:r>
+              <w:rPr>
+                <w:sz w:val="24"/>
+                <w:szCs w:val="24"/>
+              </w:rPr>
+              <w:t xml:space="preserve"> (</w:t>
+            </w:r>
+            <w:r>
+              <w:rPr>
+                <w:sz w:val="24"/>
+                <w:szCs w:val="24"/>
+              </w:rPr>
+              <w:t>05</w:t>
+            </w:r>
+            <w:r>
+              <w:rPr>
+                <w:sz w:val="24"/>
+                <w:szCs w:val="24"/>
+              </w:rPr>
+              <w:t>/</w:t>
+            </w:r>
+            <w:r>
+              <w:rPr>
+                <w:sz w:val="24"/>
+                <w:szCs w:val="24"/>
+              </w:rPr>
+              <w:t>01</w:t>
+            </w:r>
+            <w:r>
+              <w:rPr>
+                <w:sz w:val="24"/>
+                <w:szCs w:val="24"/>
+              </w:rPr>
+              <w:t xml:space="preserve"> </w:t>
+            </w:r>
+            <w:r>
+              <w:rPr>
+                <w:sz w:val="24"/>
+                <w:szCs w:val="24"/>
+              </w:rPr>
+              <w:t>–</w:t>
+            </w:r>
+            <w:r>
+              <w:rPr>
+                <w:sz w:val="24"/>
+                <w:szCs w:val="24"/>
+              </w:rPr>
+              <w:t xml:space="preserve"> </w:t>
+            </w:r>
+            <w:r>
+              <w:rPr>
+                <w:sz w:val="24"/>
+                <w:szCs w:val="24"/>
+              </w:rPr>
+              <w:t>11</w:t>
+            </w:r>
+            <w:r>
+              <w:rPr>
+                <w:sz w:val="24"/>
+                <w:szCs w:val="24"/>
+              </w:rPr>
+              <w:t>/01</w:t>
+            </w:r>
+            <w:r>
+              <w:rPr>
+                <w:sz w:val="24"/>
+                <w:szCs w:val="24"/>
+              </w:rPr>
+              <w:t>)</w:t>
             </w:r>
           </w:p>
         </w:tc>
@@ -5032,7 +5434,6 @@
                 <w:b/>
                 <w:bCs/>
               </w:rPr>
-              <w:lastRenderedPageBreak/>
               <w:t>Trưởng Bộ Môn</w:t>
             </w:r>
           </w:p>

</xml_diff>

<commit_message>
add resting state, wood, lumberjack,fast travel
</commit_message>
<xml_diff>
--- a/Đề cương đồ án_6051071073_PhamHieuMinh.docx
+++ b/Đề cương đồ án_6051071073_PhamHieuMinh.docx
@@ -174,7 +174,7 @@
                     </wp:anchor>
                   </w:drawing>
                 </mc:Choice>
-                <mc:Fallback xmlns:cx1="http://schemas.microsoft.com/office/drawing/2015/9/8/chartex" xmlns:cx2="http://schemas.microsoft.com/office/drawing/2015/10/21/chartex" xmlns:cx3="http://schemas.microsoft.com/office/drawing/2016/5/9/chartex" xmlns:cx4="http://schemas.microsoft.com/office/drawing/2016/5/10/chartex" xmlns:cx5="http://schemas.microsoft.com/office/drawing/2016/5/11/chartex" xmlns:cx6="http://schemas.microsoft.com/office/drawing/2016/5/12/chartex" xmlns:cx7="http://schemas.microsoft.com/office/drawing/2016/5/13/chartex" xmlns:cx8="http://schemas.microsoft.com/office/drawing/2016/5/14/chartex" xmlns:aink="http://schemas.microsoft.com/office/drawing/2016/ink" xmlns:am3d="http://schemas.microsoft.com/office/drawing/2017/model3d" xmlns:oel="http://schemas.microsoft.com/office/2019/extlst" xmlns:w16cex="http://schemas.microsoft.com/office/word/2018/wordml/cex" xmlns:w16cid="http://schemas.microsoft.com/office/word/2016/wordml/cid" xmlns:w16="http://schemas.microsoft.com/office/word/2018/wordml" xmlns:w16du="http://schemas.microsoft.com/office/word/2023/wordml/word16du" xmlns:w16sdtdh="http://schemas.microsoft.com/office/word/2020/wordml/sdtdatahash">
+                <mc:Fallback xmlns:w16sdtdh="http://schemas.microsoft.com/office/word/2020/wordml/sdtdatahash" xmlns:w16du="http://schemas.microsoft.com/office/word/2023/wordml/word16du" xmlns:w16="http://schemas.microsoft.com/office/word/2018/wordml" xmlns:w16cid="http://schemas.microsoft.com/office/word/2016/wordml/cid" xmlns:w16cex="http://schemas.microsoft.com/office/word/2018/wordml/cex" xmlns:oel="http://schemas.microsoft.com/office/2019/extlst" xmlns:am3d="http://schemas.microsoft.com/office/drawing/2017/model3d" xmlns:aink="http://schemas.microsoft.com/office/drawing/2016/ink" xmlns:cx8="http://schemas.microsoft.com/office/drawing/2016/5/14/chartex" xmlns:cx7="http://schemas.microsoft.com/office/drawing/2016/5/13/chartex" xmlns:cx6="http://schemas.microsoft.com/office/drawing/2016/5/12/chartex" xmlns:cx5="http://schemas.microsoft.com/office/drawing/2016/5/11/chartex" xmlns:cx4="http://schemas.microsoft.com/office/drawing/2016/5/10/chartex" xmlns:cx3="http://schemas.microsoft.com/office/drawing/2016/5/9/chartex" xmlns:cx2="http://schemas.microsoft.com/office/drawing/2015/10/21/chartex" xmlns:cx1="http://schemas.microsoft.com/office/drawing/2015/9/8/chartex">
                   <w:pict>
                     <v:line w14:anchorId="23084E4B" id="Straight Connector 2" o:spid="_x0000_s1026" style="position:absolute;z-index:251665408;visibility:visible;mso-wrap-style:square;mso-width-percent:0;mso-wrap-distance-left:9pt;mso-wrap-distance-top:0;mso-wrap-distance-right:9pt;mso-wrap-distance-bottom:0;mso-position-horizontal:absolute;mso-position-horizontal-relative:text;mso-position-vertical:absolute;mso-position-vertical-relative:text;mso-width-percent:0;mso-width-relative:margin" from="77.8pt,18.65pt" to="162.1pt,18.65pt" o:gfxdata="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" strokecolor="black [3200]" strokeweight="1pt">
                       <v:stroke joinstyle="miter"/>
@@ -260,7 +260,7 @@
               </wp:anchor>
             </w:drawing>
           </mc:Choice>
-          <mc:Fallback xmlns:cx1="http://schemas.microsoft.com/office/drawing/2015/9/8/chartex" xmlns:cx2="http://schemas.microsoft.com/office/drawing/2015/10/21/chartex" xmlns:cx3="http://schemas.microsoft.com/office/drawing/2016/5/9/chartex" xmlns:cx4="http://schemas.microsoft.com/office/drawing/2016/5/10/chartex" xmlns:cx5="http://schemas.microsoft.com/office/drawing/2016/5/11/chartex" xmlns:cx6="http://schemas.microsoft.com/office/drawing/2016/5/12/chartex" xmlns:cx7="http://schemas.microsoft.com/office/drawing/2016/5/13/chartex" xmlns:cx8="http://schemas.microsoft.com/office/drawing/2016/5/14/chartex" xmlns:aink="http://schemas.microsoft.com/office/drawing/2016/ink" xmlns:am3d="http://schemas.microsoft.com/office/drawing/2017/model3d" xmlns:oel="http://schemas.microsoft.com/office/2019/extlst" xmlns:w16cex="http://schemas.microsoft.com/office/word/2018/wordml/cex" xmlns:w16cid="http://schemas.microsoft.com/office/word/2016/wordml/cid" xmlns:w16="http://schemas.microsoft.com/office/word/2018/wordml" xmlns:w16du="http://schemas.microsoft.com/office/word/2023/wordml/word16du" xmlns:w16sdtdh="http://schemas.microsoft.com/office/word/2020/wordml/sdtdatahash">
+          <mc:Fallback xmlns:w16sdtdh="http://schemas.microsoft.com/office/word/2020/wordml/sdtdatahash" xmlns:w16du="http://schemas.microsoft.com/office/word/2023/wordml/word16du" xmlns:w16="http://schemas.microsoft.com/office/word/2018/wordml" xmlns:w16cid="http://schemas.microsoft.com/office/word/2016/wordml/cid" xmlns:w16cex="http://schemas.microsoft.com/office/word/2018/wordml/cex" xmlns:oel="http://schemas.microsoft.com/office/2019/extlst" xmlns:am3d="http://schemas.microsoft.com/office/drawing/2017/model3d" xmlns:aink="http://schemas.microsoft.com/office/drawing/2016/ink" xmlns:cx8="http://schemas.microsoft.com/office/drawing/2016/5/14/chartex" xmlns:cx7="http://schemas.microsoft.com/office/drawing/2016/5/13/chartex" xmlns:cx6="http://schemas.microsoft.com/office/drawing/2016/5/12/chartex" xmlns:cx5="http://schemas.microsoft.com/office/drawing/2016/5/11/chartex" xmlns:cx4="http://schemas.microsoft.com/office/drawing/2016/5/10/chartex" xmlns:cx3="http://schemas.microsoft.com/office/drawing/2016/5/9/chartex" xmlns:cx2="http://schemas.microsoft.com/office/drawing/2015/10/21/chartex" xmlns:cx1="http://schemas.microsoft.com/office/drawing/2015/9/8/chartex">
             <w:pict>
               <v:line w14:anchorId="2588C48D" id="Straight Connector 1" o:spid="_x0000_s1026" style="position:absolute;z-index:251663360;visibility:visible;mso-wrap-style:square;mso-wrap-distance-left:9pt;mso-wrap-distance-top:0;mso-wrap-distance-right:9pt;mso-wrap-distance-bottom:0;mso-position-horizontal:absolute;mso-position-horizontal-relative:text;mso-position-vertical:absolute;mso-position-vertical-relative:text" from="45.85pt,4.5pt" to="165.7pt,4.5pt" o:gfxdata="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" strokecolor="black [3200]" strokeweight="1pt">
                 <v:stroke joinstyle="miter"/>
@@ -4896,8 +4896,6 @@
               </w:rPr>
               <w:t>Đã hoàn thành</w:t>
             </w:r>
-            <w:bookmarkStart w:id="0" w:name="_GoBack"/>
-            <w:bookmarkEnd w:id="0"/>
           </w:p>
         </w:tc>
         <w:tc>
@@ -5027,14 +5025,7 @@
                 <w:sz w:val="24"/>
                 <w:szCs w:val="24"/>
               </w:rPr>
-              <w:t>11</w:t>
-            </w:r>
-            <w:r>
-              <w:rPr>
-                <w:sz w:val="24"/>
-                <w:szCs w:val="24"/>
-              </w:rPr>
-              <w:t>/01</w:t>
+              <w:t>11/01</w:t>
             </w:r>
             <w:r>
               <w:rPr>
@@ -5104,7 +5095,7 @@
                 <w:sz w:val="24"/>
                 <w:szCs w:val="24"/>
               </w:rPr>
-              <w:t>Chưa hoàn thành</w:t>
+              <w:t>Đã hoàn thành</w:t>
             </w:r>
           </w:p>
         </w:tc>
@@ -5122,7 +5113,6 @@
                 <w:right w:val="nil"/>
                 <w:between w:val="nil"/>
               </w:pBdr>
-              <w:ind w:firstLine="720"/>
               <w:rPr>
                 <w:sz w:val="24"/>
                 <w:szCs w:val="24"/>
@@ -5166,7 +5156,213 @@
                 <w:sz w:val="24"/>
                 <w:szCs w:val="24"/>
               </w:rPr>
-              <w:t>Tuần 11 (29/12 - 04/01)</w:t>
+              <w:t>Tuần 12</w:t>
+            </w:r>
+          </w:p>
+          <w:p>
+            <w:pPr>
+              <w:widowControl w:val="0"/>
+              <w:pBdr>
+                <w:top w:val="nil"/>
+                <w:left w:val="nil"/>
+                <w:bottom w:val="nil"/>
+                <w:right w:val="nil"/>
+                <w:between w:val="nil"/>
+              </w:pBdr>
+              <w:rPr>
+                <w:sz w:val="24"/>
+                <w:szCs w:val="24"/>
+              </w:rPr>
+            </w:pPr>
+            <w:r>
+              <w:rPr>
+                <w:sz w:val="24"/>
+                <w:szCs w:val="24"/>
+              </w:rPr>
+              <w:t>(12/01 – 19/01)</w:t>
+            </w:r>
+          </w:p>
+        </w:tc>
+        <w:tc>
+          <w:tcPr>
+            <w:tcW w:w="3150" w:type="dxa"/>
+            <w:shd w:val="clear" w:color="auto" w:fill="auto"/>
+            <w:tcMar>
+              <w:top w:w="100" w:type="dxa"/>
+              <w:left w:w="100" w:type="dxa"/>
+              <w:bottom w:w="100" w:type="dxa"/>
+              <w:right w:w="100" w:type="dxa"/>
+            </w:tcMar>
+          </w:tcPr>
+          <w:p>
+            <w:pPr>
+              <w:widowControl w:val="0"/>
+              <w:pBdr>
+                <w:top w:val="nil"/>
+                <w:left w:val="nil"/>
+                <w:bottom w:val="nil"/>
+                <w:right w:val="nil"/>
+                <w:between w:val="nil"/>
+              </w:pBdr>
+              <w:rPr>
+                <w:sz w:val="24"/>
+                <w:szCs w:val="24"/>
+              </w:rPr>
+            </w:pPr>
+            <w:r>
+              <w:rPr>
+                <w:sz w:val="24"/>
+                <w:szCs w:val="24"/>
+              </w:rPr>
+              <w:t>Thêm hệ thống phần thưởng. Nâng cấp hệ thống nhiệm vụ, hệ thống thể lực, hệ thống xây dựng</w:t>
+            </w:r>
+          </w:p>
+        </w:tc>
+        <w:tc>
+          <w:tcPr>
+            <w:tcW w:w="1530" w:type="dxa"/>
+          </w:tcPr>
+          <w:p>
+            <w:pPr>
+              <w:widowControl w:val="0"/>
+              <w:pBdr>
+                <w:top w:val="nil"/>
+                <w:left w:val="nil"/>
+                <w:bottom w:val="nil"/>
+                <w:right w:val="nil"/>
+                <w:between w:val="nil"/>
+              </w:pBdr>
+              <w:rPr>
+                <w:sz w:val="24"/>
+                <w:szCs w:val="24"/>
+              </w:rPr>
+            </w:pPr>
+            <w:r>
+              <w:rPr>
+                <w:sz w:val="24"/>
+                <w:szCs w:val="24"/>
+              </w:rPr>
+              <w:t>Chưa hoàn thành</w:t>
+            </w:r>
+          </w:p>
+        </w:tc>
+        <w:tc>
+          <w:tcPr>
+            <w:tcW w:w="1530" w:type="dxa"/>
+          </w:tcPr>
+          <w:p>
+            <w:pPr>
+              <w:widowControl w:val="0"/>
+              <w:pBdr>
+                <w:top w:val="nil"/>
+                <w:left w:val="nil"/>
+                <w:bottom w:val="nil"/>
+                <w:right w:val="nil"/>
+                <w:between w:val="nil"/>
+              </w:pBdr>
+              <w:rPr>
+                <w:sz w:val="24"/>
+                <w:szCs w:val="24"/>
+              </w:rPr>
+            </w:pPr>
+          </w:p>
+        </w:tc>
+      </w:tr>
+      <w:tr>
+        <w:trPr>
+          <w:trHeight w:val="275"/>
+        </w:trPr>
+        <w:tc>
+          <w:tcPr>
+            <w:tcW w:w="1530" w:type="dxa"/>
+            <w:shd w:val="clear" w:color="auto" w:fill="auto"/>
+            <w:tcMar>
+              <w:top w:w="100" w:type="dxa"/>
+              <w:left w:w="100" w:type="dxa"/>
+              <w:bottom w:w="100" w:type="dxa"/>
+              <w:right w:w="100" w:type="dxa"/>
+            </w:tcMar>
+          </w:tcPr>
+          <w:p>
+            <w:pPr>
+              <w:widowControl w:val="0"/>
+              <w:pBdr>
+                <w:top w:val="nil"/>
+                <w:left w:val="nil"/>
+                <w:bottom w:val="nil"/>
+                <w:right w:val="nil"/>
+                <w:between w:val="nil"/>
+              </w:pBdr>
+              <w:rPr>
+                <w:sz w:val="24"/>
+                <w:szCs w:val="24"/>
+              </w:rPr>
+            </w:pPr>
+            <w:r>
+              <w:rPr>
+                <w:sz w:val="24"/>
+                <w:szCs w:val="24"/>
+              </w:rPr>
+              <w:lastRenderedPageBreak/>
+              <w:t>Tuần 1</w:t>
+            </w:r>
+            <w:r>
+              <w:rPr>
+                <w:sz w:val="24"/>
+                <w:szCs w:val="24"/>
+              </w:rPr>
+              <w:t>3</w:t>
+            </w:r>
+            <w:r>
+              <w:rPr>
+                <w:sz w:val="24"/>
+                <w:szCs w:val="24"/>
+              </w:rPr>
+              <w:t xml:space="preserve"> (</w:t>
+            </w:r>
+            <w:r>
+              <w:rPr>
+                <w:sz w:val="24"/>
+                <w:szCs w:val="24"/>
+              </w:rPr>
+              <w:t>20</w:t>
+            </w:r>
+            <w:r>
+              <w:rPr>
+                <w:sz w:val="24"/>
+                <w:szCs w:val="24"/>
+              </w:rPr>
+              <w:t>/</w:t>
+            </w:r>
+            <w:r>
+              <w:rPr>
+                <w:sz w:val="24"/>
+                <w:szCs w:val="24"/>
+              </w:rPr>
+              <w:t>01</w:t>
+            </w:r>
+            <w:r>
+              <w:rPr>
+                <w:sz w:val="24"/>
+                <w:szCs w:val="24"/>
+              </w:rPr>
+              <w:t xml:space="preserve"> - </w:t>
+            </w:r>
+            <w:r>
+              <w:rPr>
+                <w:sz w:val="24"/>
+                <w:szCs w:val="24"/>
+              </w:rPr>
+              <w:t>26</w:t>
+            </w:r>
+            <w:bookmarkStart w:id="0" w:name="_GoBack"/>
+            <w:bookmarkEnd w:id="0"/>
+            <w:r>
+              <w:rPr>
+                <w:sz w:val="24"/>
+                <w:szCs w:val="24"/>
+              </w:rPr>
+              <w:t>/01)</w:t>
             </w:r>
           </w:p>
         </w:tc>

</xml_diff>